<commit_message>
modified:   notas.docx 	modified:   scripts/arbol-valores.js
</commit_message>
<xml_diff>
--- a/notas.docx
+++ b/notas.docx
@@ -106,7 +106,7 @@
           <w14:ligatures w14:val="none"/>
         </w:rPr>
         <w:pict w14:anchorId="58C06472">
-          <v:rect id="_x0000_i1424" style="width:0;height:1.5pt" o:hralign="center" o:hrstd="t" o:hr="t" fillcolor="#a0a0a0" stroked="f"/>
+          <v:rect id="_x0000_i1025" style="width:0;height:1.5pt" o:hralign="center" o:hrstd="t" o:hr="t" fillcolor="#a0a0a0" stroked="f"/>
         </w:pict>
       </w:r>
     </w:p>
@@ -297,7 +297,7 @@
           <w14:ligatures w14:val="none"/>
         </w:rPr>
         <w:pict w14:anchorId="67DA4C05">
-          <v:rect id="_x0000_i1425" style="width:0;height:1.5pt" o:hralign="center" o:hrstd="t" o:hr="t" fillcolor="#a0a0a0" stroked="f"/>
+          <v:rect id="_x0000_i1026" style="width:0;height:1.5pt" o:hralign="center" o:hrstd="t" o:hr="t" fillcolor="#a0a0a0" stroked="f"/>
         </w:pict>
       </w:r>
     </w:p>
@@ -509,7 +509,7 @@
           <w14:ligatures w14:val="none"/>
         </w:rPr>
         <w:pict w14:anchorId="3CA33728">
-          <v:rect id="_x0000_i1426" style="width:0;height:1.5pt" o:hralign="center" o:hrstd="t" o:hr="t" fillcolor="#a0a0a0" stroked="f"/>
+          <v:rect id="_x0000_i1027" style="width:0;height:1.5pt" o:hralign="center" o:hrstd="t" o:hr="t" fillcolor="#a0a0a0" stroked="f"/>
         </w:pict>
       </w:r>
     </w:p>
@@ -606,7 +606,7 @@
           <w14:ligatures w14:val="none"/>
         </w:rPr>
         <w:pict w14:anchorId="5C87BD1D">
-          <v:rect id="_x0000_i1427" style="width:0;height:1.5pt" o:hralign="center" o:hrstd="t" o:hr="t" fillcolor="#a0a0a0" stroked="f"/>
+          <v:rect id="_x0000_i1028" style="width:0;height:1.5pt" o:hralign="center" o:hrstd="t" o:hr="t" fillcolor="#a0a0a0" stroked="f"/>
         </w:pict>
       </w:r>
     </w:p>
@@ -703,7 +703,7 @@
           <w14:ligatures w14:val="none"/>
         </w:rPr>
         <w:pict w14:anchorId="5E6EFB98">
-          <v:rect id="_x0000_i1428" style="width:0;height:1.5pt" o:hralign="center" o:hrstd="t" o:hr="t" fillcolor="#a0a0a0" stroked="f"/>
+          <v:rect id="_x0000_i1029" style="width:0;height:1.5pt" o:hralign="center" o:hrstd="t" o:hr="t" fillcolor="#a0a0a0" stroked="f"/>
         </w:pict>
       </w:r>
     </w:p>
@@ -979,7 +979,7 @@
           <w14:ligatures w14:val="none"/>
         </w:rPr>
         <w:pict w14:anchorId="62B6CBEF">
-          <v:rect id="_x0000_i1429" style="width:0;height:1.5pt" o:hralign="center" o:hrstd="t" o:hr="t" fillcolor="#a0a0a0" stroked="f"/>
+          <v:rect id="_x0000_i1030" style="width:0;height:1.5pt" o:hralign="center" o:hrstd="t" o:hr="t" fillcolor="#a0a0a0" stroked="f"/>
         </w:pict>
       </w:r>
     </w:p>
@@ -1080,7 +1080,7 @@
           <w14:ligatures w14:val="none"/>
         </w:rPr>
         <w:pict w14:anchorId="19BA883D">
-          <v:rect id="_x0000_i1430" style="width:0;height:1.5pt" o:hralign="center" o:hrstd="t" o:hr="t" fillcolor="#a0a0a0" stroked="f"/>
+          <v:rect id="_x0000_i1031" style="width:0;height:1.5pt" o:hralign="center" o:hrstd="t" o:hr="t" fillcolor="#a0a0a0" stroked="f"/>
         </w:pict>
       </w:r>
     </w:p>
@@ -1308,6 +1308,571 @@
           <w14:ligatures w14:val="none"/>
         </w:rPr>
         <w:t>Selecciona el repositorio remoto existente.</w:t>
+      </w:r>
+    </w:p>
+    <w:p/>
+    <w:p>
+      <w:pPr>
+        <w:spacing w:before="100" w:beforeAutospacing="1" w:after="100" w:afterAutospacing="1" w:line="240" w:lineRule="auto"/>
+        <w:outlineLvl w:val="1"/>
+        <w:rPr>
+          <w:rFonts w:ascii="Times New Roman" w:eastAsia="Times New Roman" w:hAnsi="Times New Roman" w:cs="Times New Roman"/>
+          <w:b/>
+          <w:bCs/>
+          <w:kern w:val="0"/>
+          <w:sz w:val="36"/>
+          <w:szCs w:val="36"/>
+          <w:lang w:eastAsia="es-EC"/>
+          <w14:ligatures w14:val="none"/>
+        </w:rPr>
+      </w:pPr>
+      <w:r>
+        <w:rPr>
+          <w:rFonts w:ascii="Times New Roman" w:eastAsia="Times New Roman" w:hAnsi="Times New Roman" w:cs="Times New Roman"/>
+          <w:b/>
+          <w:bCs/>
+          <w:kern w:val="0"/>
+          <w:sz w:val="36"/>
+          <w:szCs w:val="36"/>
+          <w:lang w:eastAsia="es-EC"/>
+          <w14:ligatures w14:val="none"/>
+        </w:rPr>
+        <w:t>Subir cambios nuevos a GitHub</w:t>
+      </w:r>
+    </w:p>
+    <w:p>
+      <w:pPr>
+        <w:spacing w:before="100" w:beforeAutospacing="1" w:after="100" w:afterAutospacing="1" w:line="240" w:lineRule="auto"/>
+        <w:rPr>
+          <w:rFonts w:ascii="Times New Roman" w:eastAsia="Times New Roman" w:hAnsi="Times New Roman" w:cs="Times New Roman"/>
+          <w:kern w:val="0"/>
+          <w:sz w:val="24"/>
+          <w:szCs w:val="24"/>
+          <w:lang w:eastAsia="es-EC"/>
+          <w14:ligatures w14:val="none"/>
+        </w:rPr>
+      </w:pPr>
+      <w:r>
+        <w:rPr>
+          <w:rFonts w:ascii="Times New Roman" w:eastAsia="Times New Roman" w:hAnsi="Times New Roman" w:cs="Times New Roman"/>
+          <w:kern w:val="0"/>
+          <w:sz w:val="24"/>
+          <w:szCs w:val="24"/>
+          <w:lang w:eastAsia="es-EC"/>
+          <w14:ligatures w14:val="none"/>
+        </w:rPr>
+        <w:t>1️</w:t>
+      </w:r>
+      <w:r>
+        <w:rPr>
+          <w:rFonts w:ascii="Times New Roman" w:eastAsia="Times New Roman" w:hAnsi="Times New Roman" w:cs="Times New Roman"/>
+          <w:b/>
+          <w:bCs/>
+          <w:kern w:val="0"/>
+          <w:sz w:val="24"/>
+          <w:szCs w:val="24"/>
+          <w:lang w:eastAsia="es-EC"/>
+          <w14:ligatures w14:val="none"/>
+        </w:rPr>
+        <w:t>Agrega los archivos modificados</w:t>
+      </w:r>
+    </w:p>
+    <w:p>
+      <w:pPr>
+        <w:tabs>
+          <w:tab w:val="left" w:pos="916"/>
+          <w:tab w:val="left" w:pos="1832"/>
+          <w:tab w:val="left" w:pos="2748"/>
+          <w:tab w:val="left" w:pos="3664"/>
+          <w:tab w:val="left" w:pos="4580"/>
+          <w:tab w:val="left" w:pos="5496"/>
+          <w:tab w:val="left" w:pos="6412"/>
+          <w:tab w:val="left" w:pos="7328"/>
+          <w:tab w:val="left" w:pos="8244"/>
+          <w:tab w:val="left" w:pos="9160"/>
+          <w:tab w:val="left" w:pos="10076"/>
+          <w:tab w:val="left" w:pos="10992"/>
+          <w:tab w:val="left" w:pos="11908"/>
+          <w:tab w:val="left" w:pos="12824"/>
+          <w:tab w:val="left" w:pos="13740"/>
+          <w:tab w:val="left" w:pos="14656"/>
+        </w:tabs>
+        <w:spacing w:after="0" w:line="240" w:lineRule="auto"/>
+        <w:rPr>
+          <w:rFonts w:ascii="Courier New" w:eastAsia="Times New Roman" w:hAnsi="Courier New" w:cs="Courier New"/>
+          <w:kern w:val="0"/>
+          <w:sz w:val="20"/>
+          <w:szCs w:val="20"/>
+          <w:lang w:eastAsia="es-EC"/>
+          <w14:ligatures w14:val="none"/>
+        </w:rPr>
+      </w:pPr>
+      <w:r>
+        <w:rPr>
+          <w:rFonts w:ascii="Courier New" w:eastAsia="Times New Roman" w:hAnsi="Courier New" w:cs="Courier New"/>
+          <w:kern w:val="0"/>
+          <w:sz w:val="20"/>
+          <w:szCs w:val="20"/>
+          <w:lang w:eastAsia="es-EC"/>
+          <w14:ligatures w14:val="none"/>
+        </w:rPr>
+        <w:t>git add .</w:t>
+      </w:r>
+    </w:p>
+    <w:p>
+      <w:pPr>
+        <w:spacing w:beforeAutospacing="1" w:after="100" w:afterAutospacing="1" w:line="240" w:lineRule="auto"/>
+        <w:rPr>
+          <w:rFonts w:ascii="Times New Roman" w:eastAsia="Times New Roman" w:hAnsi="Times New Roman" w:cs="Times New Roman"/>
+          <w:kern w:val="0"/>
+          <w:sz w:val="24"/>
+          <w:szCs w:val="24"/>
+          <w:lang w:eastAsia="es-EC"/>
+          <w14:ligatures w14:val="none"/>
+        </w:rPr>
+      </w:pPr>
+      <w:r>
+        <w:rPr>
+          <w:rFonts w:ascii="Times New Roman" w:eastAsia="Times New Roman" w:hAnsi="Times New Roman" w:cs="Times New Roman"/>
+          <w:kern w:val="0"/>
+          <w:sz w:val="24"/>
+          <w:szCs w:val="24"/>
+          <w:lang w:eastAsia="es-EC"/>
+          <w14:ligatures w14:val="none"/>
+        </w:rPr>
+        <w:t>El punto (</w:t>
+      </w:r>
+      <w:r>
+        <w:rPr>
+          <w:rFonts w:ascii="Courier New" w:eastAsia="Times New Roman" w:hAnsi="Courier New" w:cs="Courier New"/>
+          <w:kern w:val="0"/>
+          <w:sz w:val="20"/>
+          <w:szCs w:val="20"/>
+          <w:lang w:eastAsia="es-EC"/>
+          <w14:ligatures w14:val="none"/>
+        </w:rPr>
+        <w:t>.</w:t>
+      </w:r>
+      <w:r>
+        <w:rPr>
+          <w:rFonts w:ascii="Times New Roman" w:eastAsia="Times New Roman" w:hAnsi="Times New Roman" w:cs="Times New Roman"/>
+          <w:kern w:val="0"/>
+          <w:sz w:val="24"/>
+          <w:szCs w:val="24"/>
+          <w:lang w:eastAsia="es-EC"/>
+          <w14:ligatures w14:val="none"/>
+        </w:rPr>
+        <w:t>) indica “todos los archivos cambiados”.</w:t>
+      </w:r>
+    </w:p>
+    <w:p>
+      <w:pPr>
+        <w:spacing w:after="0" w:line="240" w:lineRule="auto"/>
+        <w:rPr>
+          <w:rFonts w:ascii="Times New Roman" w:eastAsia="Times New Roman" w:hAnsi="Times New Roman" w:cs="Times New Roman"/>
+          <w:kern w:val="0"/>
+          <w:sz w:val="24"/>
+          <w:szCs w:val="24"/>
+          <w:lang w:eastAsia="es-EC"/>
+          <w14:ligatures w14:val="none"/>
+        </w:rPr>
+      </w:pPr>
+      <w:r>
+        <w:rPr>
+          <w:rFonts w:ascii="Times New Roman" w:eastAsia="Times New Roman" w:hAnsi="Times New Roman" w:cs="Times New Roman"/>
+          <w:kern w:val="0"/>
+          <w:sz w:val="24"/>
+          <w:szCs w:val="24"/>
+          <w:lang w:eastAsia="es-EC"/>
+          <w14:ligatures w14:val="none"/>
+        </w:rPr>
+        <w:pict w14:anchorId="2E58CB77">
+          <v:rect id="_x0000_i1149" style="width:0;height:1.5pt" o:hralign="center" o:hrstd="t" o:hr="t" fillcolor="#a0a0a0" stroked="f"/>
+        </w:pict>
+      </w:r>
+    </w:p>
+    <w:p>
+      <w:pPr>
+        <w:spacing w:before="100" w:beforeAutospacing="1" w:after="100" w:afterAutospacing="1" w:line="240" w:lineRule="auto"/>
+        <w:rPr>
+          <w:rFonts w:ascii="Times New Roman" w:eastAsia="Times New Roman" w:hAnsi="Times New Roman" w:cs="Times New Roman"/>
+          <w:kern w:val="0"/>
+          <w:sz w:val="24"/>
+          <w:szCs w:val="24"/>
+          <w:lang w:eastAsia="es-EC"/>
+          <w14:ligatures w14:val="none"/>
+        </w:rPr>
+      </w:pPr>
+      <w:r>
+        <w:rPr>
+          <w:rFonts w:ascii="Times New Roman" w:eastAsia="Times New Roman" w:hAnsi="Times New Roman" w:cs="Times New Roman"/>
+          <w:kern w:val="0"/>
+          <w:sz w:val="24"/>
+          <w:szCs w:val="24"/>
+          <w:lang w:eastAsia="es-EC"/>
+          <w14:ligatures w14:val="none"/>
+        </w:rPr>
+        <w:t>2️</w:t>
+      </w:r>
+      <w:r>
+        <w:rPr>
+          <w:rFonts w:ascii="Times New Roman" w:eastAsia="Times New Roman" w:hAnsi="Times New Roman" w:cs="Times New Roman"/>
+          <w:b/>
+          <w:bCs/>
+          <w:kern w:val="0"/>
+          <w:sz w:val="24"/>
+          <w:szCs w:val="24"/>
+          <w:lang w:eastAsia="es-EC"/>
+          <w14:ligatures w14:val="none"/>
+        </w:rPr>
+        <w:t>Crea un commit con un mensaje</w:t>
+      </w:r>
+    </w:p>
+    <w:p>
+      <w:pPr>
+        <w:tabs>
+          <w:tab w:val="left" w:pos="916"/>
+          <w:tab w:val="left" w:pos="1832"/>
+          <w:tab w:val="left" w:pos="2748"/>
+          <w:tab w:val="left" w:pos="3664"/>
+          <w:tab w:val="left" w:pos="4580"/>
+          <w:tab w:val="left" w:pos="5496"/>
+          <w:tab w:val="left" w:pos="6412"/>
+          <w:tab w:val="left" w:pos="7328"/>
+          <w:tab w:val="left" w:pos="8244"/>
+          <w:tab w:val="left" w:pos="9160"/>
+          <w:tab w:val="left" w:pos="10076"/>
+          <w:tab w:val="left" w:pos="10992"/>
+          <w:tab w:val="left" w:pos="11908"/>
+          <w:tab w:val="left" w:pos="12824"/>
+          <w:tab w:val="left" w:pos="13740"/>
+          <w:tab w:val="left" w:pos="14656"/>
+        </w:tabs>
+        <w:spacing w:after="0" w:line="240" w:lineRule="auto"/>
+        <w:rPr>
+          <w:rFonts w:ascii="Courier New" w:eastAsia="Times New Roman" w:hAnsi="Courier New" w:cs="Courier New"/>
+          <w:kern w:val="0"/>
+          <w:sz w:val="20"/>
+          <w:szCs w:val="20"/>
+          <w:lang w:eastAsia="es-EC"/>
+          <w14:ligatures w14:val="none"/>
+        </w:rPr>
+      </w:pPr>
+      <w:r>
+        <w:rPr>
+          <w:rFonts w:ascii="Courier New" w:eastAsia="Times New Roman" w:hAnsi="Courier New" w:cs="Courier New"/>
+          <w:kern w:val="0"/>
+          <w:sz w:val="20"/>
+          <w:szCs w:val="20"/>
+          <w:lang w:eastAsia="es-EC"/>
+          <w14:ligatures w14:val="none"/>
+        </w:rPr>
+        <w:t>git commit -m "Descripción breve del cambio realizado"</w:t>
+      </w:r>
+    </w:p>
+    <w:p>
+      <w:pPr>
+        <w:spacing w:beforeAutospacing="1" w:after="100" w:afterAutospacing="1" w:line="240" w:lineRule="auto"/>
+        <w:rPr>
+          <w:rFonts w:ascii="Times New Roman" w:eastAsia="Times New Roman" w:hAnsi="Times New Roman" w:cs="Times New Roman"/>
+          <w:kern w:val="0"/>
+          <w:sz w:val="24"/>
+          <w:szCs w:val="24"/>
+          <w:lang w:eastAsia="es-EC"/>
+          <w14:ligatures w14:val="none"/>
+        </w:rPr>
+      </w:pPr>
+      <w:r>
+        <w:rPr>
+          <w:rFonts w:ascii="Times New Roman" w:eastAsia="Times New Roman" w:hAnsi="Times New Roman" w:cs="Times New Roman"/>
+          <w:kern w:val="0"/>
+          <w:sz w:val="24"/>
+          <w:szCs w:val="24"/>
+          <w:lang w:eastAsia="es-EC"/>
+          <w14:ligatures w14:val="none"/>
+        </w:rPr>
+        <w:t>Ejemplo:</w:t>
+      </w:r>
+      <w:r>
+        <w:rPr>
+          <w:rFonts w:ascii="Times New Roman" w:eastAsia="Times New Roman" w:hAnsi="Times New Roman" w:cs="Times New Roman"/>
+          <w:kern w:val="0"/>
+          <w:sz w:val="24"/>
+          <w:szCs w:val="24"/>
+          <w:lang w:eastAsia="es-EC"/>
+          <w14:ligatures w14:val="none"/>
+        </w:rPr>
+        <w:br/>
+      </w:r>
+      <w:r>
+        <w:rPr>
+          <w:rFonts w:ascii="Courier New" w:eastAsia="Times New Roman" w:hAnsi="Courier New" w:cs="Courier New"/>
+          <w:kern w:val="0"/>
+          <w:sz w:val="20"/>
+          <w:szCs w:val="20"/>
+          <w:lang w:eastAsia="es-EC"/>
+          <w14:ligatures w14:val="none"/>
+        </w:rPr>
+        <w:t>git commit -m "Corrijo bug en función de login"</w:t>
+      </w:r>
+      <w:r>
+        <w:rPr>
+          <w:rFonts w:ascii="Times New Roman" w:eastAsia="Times New Roman" w:hAnsi="Times New Roman" w:cs="Times New Roman"/>
+          <w:kern w:val="0"/>
+          <w:sz w:val="24"/>
+          <w:szCs w:val="24"/>
+          <w:lang w:eastAsia="es-EC"/>
+          <w14:ligatures w14:val="none"/>
+        </w:rPr>
+        <w:br/>
+      </w:r>
+      <w:r>
+        <w:rPr>
+          <w:rFonts w:ascii="Courier New" w:eastAsia="Times New Roman" w:hAnsi="Courier New" w:cs="Courier New"/>
+          <w:kern w:val="0"/>
+          <w:sz w:val="20"/>
+          <w:szCs w:val="20"/>
+          <w:lang w:eastAsia="es-EC"/>
+          <w14:ligatures w14:val="none"/>
+        </w:rPr>
+        <w:t>git commit -m "Agrego nueva página de reportes"</w:t>
+      </w:r>
+    </w:p>
+    <w:p>
+      <w:pPr>
+        <w:spacing w:after="0" w:line="240" w:lineRule="auto"/>
+        <w:rPr>
+          <w:rFonts w:ascii="Times New Roman" w:eastAsia="Times New Roman" w:hAnsi="Times New Roman" w:cs="Times New Roman"/>
+          <w:kern w:val="0"/>
+          <w:sz w:val="24"/>
+          <w:szCs w:val="24"/>
+          <w:lang w:eastAsia="es-EC"/>
+          <w14:ligatures w14:val="none"/>
+        </w:rPr>
+      </w:pPr>
+      <w:r>
+        <w:rPr>
+          <w:rFonts w:ascii="Times New Roman" w:eastAsia="Times New Roman" w:hAnsi="Times New Roman" w:cs="Times New Roman"/>
+          <w:kern w:val="0"/>
+          <w:sz w:val="24"/>
+          <w:szCs w:val="24"/>
+          <w:lang w:eastAsia="es-EC"/>
+          <w14:ligatures w14:val="none"/>
+        </w:rPr>
+        <w:pict w14:anchorId="1F82539F">
+          <v:rect id="_x0000_i1150" style="width:0;height:1.5pt" o:hralign="center" o:hrstd="t" o:hr="t" fillcolor="#a0a0a0" stroked="f"/>
+        </w:pict>
+      </w:r>
+    </w:p>
+    <w:p>
+      <w:pPr>
+        <w:spacing w:before="100" w:beforeAutospacing="1" w:after="100" w:afterAutospacing="1" w:line="240" w:lineRule="auto"/>
+        <w:rPr>
+          <w:rFonts w:ascii="Times New Roman" w:eastAsia="Times New Roman" w:hAnsi="Times New Roman" w:cs="Times New Roman"/>
+          <w:kern w:val="0"/>
+          <w:sz w:val="24"/>
+          <w:szCs w:val="24"/>
+          <w:lang w:eastAsia="es-EC"/>
+          <w14:ligatures w14:val="none"/>
+        </w:rPr>
+      </w:pPr>
+      <w:r>
+        <w:rPr>
+          <w:rFonts w:ascii="Times New Roman" w:eastAsia="Times New Roman" w:hAnsi="Times New Roman" w:cs="Times New Roman"/>
+          <w:kern w:val="0"/>
+          <w:sz w:val="24"/>
+          <w:szCs w:val="24"/>
+          <w:lang w:eastAsia="es-EC"/>
+          <w14:ligatures w14:val="none"/>
+        </w:rPr>
+        <w:t>3️</w:t>
+      </w:r>
+      <w:r>
+        <w:rPr>
+          <w:rFonts w:ascii="Times New Roman" w:eastAsia="Times New Roman" w:hAnsi="Times New Roman" w:cs="Times New Roman"/>
+          <w:b/>
+          <w:bCs/>
+          <w:kern w:val="0"/>
+          <w:sz w:val="24"/>
+          <w:szCs w:val="24"/>
+          <w:lang w:eastAsia="es-EC"/>
+          <w14:ligatures w14:val="none"/>
+        </w:rPr>
+        <w:t>Sube los cambios al repositorio remoto</w:t>
+      </w:r>
+    </w:p>
+    <w:p>
+      <w:pPr>
+        <w:tabs>
+          <w:tab w:val="left" w:pos="916"/>
+          <w:tab w:val="left" w:pos="1832"/>
+          <w:tab w:val="left" w:pos="2748"/>
+          <w:tab w:val="left" w:pos="3664"/>
+          <w:tab w:val="left" w:pos="4580"/>
+          <w:tab w:val="left" w:pos="5496"/>
+          <w:tab w:val="left" w:pos="6412"/>
+          <w:tab w:val="left" w:pos="7328"/>
+          <w:tab w:val="left" w:pos="8244"/>
+          <w:tab w:val="left" w:pos="9160"/>
+          <w:tab w:val="left" w:pos="10076"/>
+          <w:tab w:val="left" w:pos="10992"/>
+          <w:tab w:val="left" w:pos="11908"/>
+          <w:tab w:val="left" w:pos="12824"/>
+          <w:tab w:val="left" w:pos="13740"/>
+          <w:tab w:val="left" w:pos="14656"/>
+        </w:tabs>
+        <w:spacing w:after="0" w:line="240" w:lineRule="auto"/>
+        <w:rPr>
+          <w:rFonts w:ascii="Courier New" w:eastAsia="Times New Roman" w:hAnsi="Courier New" w:cs="Courier New"/>
+          <w:kern w:val="0"/>
+          <w:sz w:val="20"/>
+          <w:szCs w:val="20"/>
+          <w:lang w:eastAsia="es-EC"/>
+          <w14:ligatures w14:val="none"/>
+        </w:rPr>
+      </w:pPr>
+      <w:r>
+        <w:rPr>
+          <w:rFonts w:ascii="Courier New" w:eastAsia="Times New Roman" w:hAnsi="Courier New" w:cs="Courier New"/>
+          <w:kern w:val="0"/>
+          <w:sz w:val="20"/>
+          <w:szCs w:val="20"/>
+          <w:lang w:eastAsia="es-EC"/>
+          <w14:ligatures w14:val="none"/>
+        </w:rPr>
+        <w:t>git push</w:t>
+      </w:r>
+    </w:p>
+    <w:p>
+      <w:pPr>
+        <w:spacing w:beforeAutospacing="1" w:after="100" w:afterAutospacing="1" w:line="240" w:lineRule="auto"/>
+        <w:rPr>
+          <w:rFonts w:ascii="Times New Roman" w:eastAsia="Times New Roman" w:hAnsi="Times New Roman" w:cs="Times New Roman"/>
+          <w:kern w:val="0"/>
+          <w:sz w:val="24"/>
+          <w:szCs w:val="24"/>
+          <w:lang w:eastAsia="es-EC"/>
+          <w14:ligatures w14:val="none"/>
+        </w:rPr>
+      </w:pPr>
+      <w:r>
+        <w:rPr>
+          <w:rFonts w:ascii="Times New Roman" w:eastAsia="Times New Roman" w:hAnsi="Times New Roman" w:cs="Times New Roman"/>
+          <w:kern w:val="0"/>
+          <w:sz w:val="24"/>
+          <w:szCs w:val="24"/>
+          <w:lang w:eastAsia="es-EC"/>
+          <w14:ligatures w14:val="none"/>
+        </w:rPr>
+        <w:t>Si es la primera vez en una nueva rama, puede que necesites usar:</w:t>
+      </w:r>
+      <w:r>
+        <w:rPr>
+          <w:rFonts w:ascii="Times New Roman" w:eastAsia="Times New Roman" w:hAnsi="Times New Roman" w:cs="Times New Roman"/>
+          <w:kern w:val="0"/>
+          <w:sz w:val="24"/>
+          <w:szCs w:val="24"/>
+          <w:lang w:eastAsia="es-EC"/>
+          <w14:ligatures w14:val="none"/>
+        </w:rPr>
+        <w:br/>
+      </w:r>
+      <w:r>
+        <w:rPr>
+          <w:rFonts w:ascii="Courier New" w:eastAsia="Times New Roman" w:hAnsi="Courier New" w:cs="Courier New"/>
+          <w:kern w:val="0"/>
+          <w:sz w:val="20"/>
+          <w:szCs w:val="20"/>
+          <w:lang w:eastAsia="es-EC"/>
+          <w14:ligatures w14:val="none"/>
+        </w:rPr>
+        <w:t>git push -u origin main</w:t>
+      </w:r>
+    </w:p>
+    <w:p>
+      <w:pPr>
+        <w:spacing w:after="0" w:line="240" w:lineRule="auto"/>
+        <w:rPr>
+          <w:rFonts w:ascii="Times New Roman" w:eastAsia="Times New Roman" w:hAnsi="Times New Roman" w:cs="Times New Roman"/>
+          <w:kern w:val="0"/>
+          <w:sz w:val="24"/>
+          <w:szCs w:val="24"/>
+          <w:lang w:eastAsia="es-EC"/>
+          <w14:ligatures w14:val="none"/>
+        </w:rPr>
+      </w:pPr>
+      <w:r>
+        <w:rPr>
+          <w:rFonts w:ascii="Times New Roman" w:eastAsia="Times New Roman" w:hAnsi="Times New Roman" w:cs="Times New Roman"/>
+          <w:kern w:val="0"/>
+          <w:sz w:val="24"/>
+          <w:szCs w:val="24"/>
+          <w:lang w:eastAsia="es-EC"/>
+          <w14:ligatures w14:val="none"/>
+        </w:rPr>
+        <w:lastRenderedPageBreak/>
+        <w:pict w14:anchorId="65CEC7DC">
+          <v:rect id="_x0000_i1151" style="width:0;height:1.5pt" o:hralign="center" o:hrstd="t" o:hr="t" fillcolor="#a0a0a0" stroked="f"/>
+        </w:pict>
+      </w:r>
+    </w:p>
+    <w:p>
+      <w:pPr>
+        <w:spacing w:before="100" w:beforeAutospacing="1" w:after="100" w:afterAutospacing="1" w:line="240" w:lineRule="auto"/>
+        <w:rPr>
+          <w:rFonts w:ascii="Times New Roman" w:eastAsia="Times New Roman" w:hAnsi="Times New Roman" w:cs="Times New Roman"/>
+          <w:kern w:val="0"/>
+          <w:sz w:val="24"/>
+          <w:szCs w:val="24"/>
+          <w:lang w:eastAsia="es-EC"/>
+          <w14:ligatures w14:val="none"/>
+        </w:rPr>
+      </w:pPr>
+      <w:r>
+        <w:rPr>
+          <w:rFonts w:ascii="Segoe UI Emoji" w:eastAsia="Times New Roman" w:hAnsi="Segoe UI Emoji" w:cs="Segoe UI Emoji"/>
+          <w:kern w:val="0"/>
+          <w:sz w:val="24"/>
+          <w:szCs w:val="24"/>
+          <w:lang w:eastAsia="es-EC"/>
+          <w14:ligatures w14:val="none"/>
+        </w:rPr>
+        <w:t>✅</w:t>
+      </w:r>
+      <w:r>
+        <w:rPr>
+          <w:rFonts w:ascii="Times New Roman" w:eastAsia="Times New Roman" w:hAnsi="Times New Roman" w:cs="Times New Roman"/>
+          <w:kern w:val="0"/>
+          <w:sz w:val="24"/>
+          <w:szCs w:val="24"/>
+          <w:lang w:eastAsia="es-EC"/>
+          <w14:ligatures w14:val="none"/>
+        </w:rPr>
+        <w:t xml:space="preserve"> </w:t>
+      </w:r>
+      <w:r>
+        <w:rPr>
+          <w:rFonts w:ascii="Times New Roman" w:eastAsia="Times New Roman" w:hAnsi="Times New Roman" w:cs="Times New Roman"/>
+          <w:b/>
+          <w:bCs/>
+          <w:kern w:val="0"/>
+          <w:sz w:val="24"/>
+          <w:szCs w:val="24"/>
+          <w:lang w:eastAsia="es-EC"/>
+          <w14:ligatures w14:val="none"/>
+        </w:rPr>
+        <w:t>Y listo:</w:t>
+      </w:r>
+      <w:r>
+        <w:rPr>
+          <w:rFonts w:ascii="Times New Roman" w:eastAsia="Times New Roman" w:hAnsi="Times New Roman" w:cs="Times New Roman"/>
+          <w:kern w:val="0"/>
+          <w:sz w:val="24"/>
+          <w:szCs w:val="24"/>
+          <w:lang w:eastAsia="es-EC"/>
+          <w14:ligatures w14:val="none"/>
+        </w:rPr>
+        <w:t xml:space="preserve"> tus cambios se reflejarán en GitHub inmediatamente.</w:t>
       </w:r>
     </w:p>
     <w:p/>

</xml_diff>